<commit_message>
Fix: Documentación link GITHUB
</commit_message>
<xml_diff>
--- a/docs/word/INFORME_FINAL.docx
+++ b/docs/word/INFORME_FINAL.docx
@@ -6677,7 +6677,15 @@
       </w:r>
       <w:proofErr w:type="spellEnd"/>
       <w:r>
-        <w:t xml:space="preserve"> a </w:t>
+        <w:t xml:space="preserve"> </w:t>
+      </w:r>
+      <w:proofErr w:type="gramStart"/>
+      <w:r>
+        <w:t>a</w:t>
+      </w:r>
+      <w:proofErr w:type="gramEnd"/>
+      <w:r>
+        <w:t xml:space="preserve"> </w:t>
       </w:r>
       <w:proofErr w:type="spellStart"/>
       <w:r>
@@ -9147,7 +9155,15 @@
       </w:r>
       <w:proofErr w:type="spellEnd"/>
       <w:r>
-        <w:t xml:space="preserve"> a </w:t>
+        <w:t xml:space="preserve"> </w:t>
+      </w:r>
+      <w:proofErr w:type="gramStart"/>
+      <w:r>
+        <w:t>a</w:t>
+      </w:r>
+      <w:proofErr w:type="gramEnd"/>
+      <w:r>
+        <w:t xml:space="preserve"> </w:t>
       </w:r>
       <w:proofErr w:type="spellStart"/>
       <w:r>
@@ -9942,6 +9958,17 @@
         </w:rPr>
         <w:t xml:space="preserve"> </w:t>
       </w:r>
+      <w:r>
+        <w:rPr>
+          <w:rFonts w:eastAsiaTheme="majorEastAsia" w:cs="Arial"/>
+          <w:b/>
+          <w:spacing w:val="5"/>
+          <w:kern w:val="28"/>
+          <w:sz w:val="28"/>
+          <w:szCs w:val="28"/>
+        </w:rPr>
+        <w:t>y GitHub</w:t>
+      </w:r>
     </w:p>
     <w:p>
       <w:pPr>
@@ -9966,7 +9993,31 @@
             <w:sz w:val="28"/>
             <w:szCs w:val="28"/>
           </w:rPr>
-          <w:t>https://view.genially.com/6a5d53f90dade624a2a4a644</w:t>
+          <w:t>https://view.genially.com/6a5d53f90da</w:t>
+        </w:r>
+        <w:r>
+          <w:rPr>
+            <w:rStyle w:val="Hipervnculo"/>
+            <w:rFonts w:eastAsiaTheme="majorEastAsia" w:cs="Arial"/>
+            <w:b/>
+            <w:spacing w:val="5"/>
+            <w:kern w:val="28"/>
+            <w:sz w:val="28"/>
+            <w:szCs w:val="28"/>
+          </w:rPr>
+          <w:t>d</w:t>
+        </w:r>
+        <w:r>
+          <w:rPr>
+            <w:rStyle w:val="Hipervnculo"/>
+            <w:rFonts w:eastAsiaTheme="majorEastAsia" w:cs="Arial"/>
+            <w:b/>
+            <w:spacing w:val="5"/>
+            <w:kern w:val="28"/>
+            <w:sz w:val="28"/>
+            <w:szCs w:val="28"/>
+          </w:rPr>
+          <w:t>e624a2a4a644</w:t>
         </w:r>
       </w:hyperlink>
       <w:r>
@@ -9983,12 +10034,87 @@
     </w:p>
     <w:p>
       <w:pPr>
+        <w:spacing w:after="200"/>
+        <w:rPr>
+          <w:rFonts w:eastAsiaTheme="majorEastAsia" w:cs="Arial"/>
+          <w:b/>
+          <w:spacing w:val="5"/>
+          <w:kern w:val="28"/>
+          <w:sz w:val="28"/>
+          <w:szCs w:val="28"/>
+        </w:rPr>
+      </w:pPr>
+      <w:hyperlink r:id="rId14" w:history="1">
+        <w:r>
+          <w:rPr>
+            <w:rStyle w:val="Hipervnculo"/>
+            <w:rFonts w:eastAsiaTheme="majorEastAsia" w:cs="Arial"/>
+            <w:b/>
+            <w:spacing w:val="5"/>
+            <w:kern w:val="28"/>
+            <w:sz w:val="28"/>
+            <w:szCs w:val="28"/>
+          </w:rPr>
+          <w:t>https://github.com/Arielpassw/ProyectoI</w:t>
+        </w:r>
+        <w:r>
+          <w:rPr>
+            <w:rStyle w:val="Hipervnculo"/>
+            <w:rFonts w:eastAsiaTheme="majorEastAsia" w:cs="Arial"/>
+            <w:b/>
+            <w:spacing w:val="5"/>
+            <w:kern w:val="28"/>
+            <w:sz w:val="28"/>
+            <w:szCs w:val="28"/>
+          </w:rPr>
+          <w:t>A</w:t>
+        </w:r>
+        <w:r>
+          <w:rPr>
+            <w:rStyle w:val="Hipervnculo"/>
+            <w:rFonts w:eastAsiaTheme="majorEastAsia" w:cs="Arial"/>
+            <w:b/>
+            <w:spacing w:val="5"/>
+            <w:kern w:val="28"/>
+            <w:sz w:val="28"/>
+            <w:szCs w:val="28"/>
+          </w:rPr>
+          <w:t>.git</w:t>
+        </w:r>
+      </w:hyperlink>
+      <w:r>
+        <w:rPr>
+          <w:rFonts w:eastAsiaTheme="majorEastAsia" w:cs="Arial"/>
+          <w:b/>
+          <w:spacing w:val="5"/>
+          <w:kern w:val="28"/>
+          <w:sz w:val="28"/>
+          <w:szCs w:val="28"/>
+        </w:rPr>
+        <w:t xml:space="preserve"> </w:t>
+      </w:r>
+    </w:p>
+    <w:p>
+      <w:pPr>
+        <w:spacing w:after="200"/>
+        <w:rPr>
+          <w:rFonts w:eastAsiaTheme="majorEastAsia" w:cs="Arial"/>
+          <w:b/>
+          <w:spacing w:val="5"/>
+          <w:kern w:val="28"/>
+          <w:sz w:val="28"/>
+          <w:szCs w:val="28"/>
+        </w:rPr>
+      </w:pPr>
+    </w:p>
+    <w:p>
+      <w:pPr>
         <w:spacing w:line="360" w:lineRule="auto"/>
       </w:pPr>
     </w:p>
     <w:sectPr>
-      <w:headerReference w:type="default" r:id="rId14"/>
-      <w:footerReference w:type="default" r:id="rId15"/>
+      <w:headerReference w:type="default" r:id="rId15"/>
+      <w:footerReference w:type="default" r:id="rId16"/>
       <w:pgSz w:w="11906" w:h="16838"/>
       <w:pgMar w:top="1247" w:right="1417" w:bottom="1134" w:left="1417" w:header="720" w:footer="720" w:gutter="0"/>
       <w:cols w:space="720"/>
@@ -21982,6 +22108,18 @@
       <w:shd w:val="clear" w:color="auto" w:fill="E1DFDD"/>
     </w:rPr>
   </w:style>
+  <w:style w:type="character" w:styleId="Hipervnculovisitado">
+    <w:name w:val="FollowedHyperlink"/>
+    <w:basedOn w:val="Fuentedeprrafopredeter"/>
+    <w:uiPriority w:val="99"/>
+    <w:semiHidden/>
+    <w:unhideWhenUsed/>
+    <w:rsid w:val="00094C11"/>
+    <w:rPr>
+      <w:color w:val="800080" w:themeColor="followedHyperlink"/>
+      <w:u w:val="single"/>
+    </w:rPr>
+  </w:style>
 </w:styles>
 </file>
 

</xml_diff>